<commit_message>
chore: rename project to WeatherWell
Updates package.json, launch config, and doc titles (PRD, IDEA,
technical spec) to the WeatherWell product name, keeping the
original challenge title as context. GitHub repo and local folder
renamed to match (folder rename completes next turn due to an
active directory lock).
</commit_message>
<xml_diff>
--- a/IDEA.docx
+++ b/IDEA.docx
@@ -30,14 +30,28 @@
     </w:p>
     <w:p>
       <w:pPr>
-        <w:spacing w:after="300"/>
+        <w:spacing w:after="60"/>
       </w:pPr>
       <w:r>
         <w:rPr>
           <w:b/>
           <w:bCs/>
-        </w:rPr>
-        <w:t xml:space="preserve">Climate Resilience and Hydrometeorological Disaster Management</w:t>
+          <w:sz w:val="28"/>
+          <w:szCs w:val="28"/>
+        </w:rPr>
+        <w:t xml:space="preserve">WeatherWell</w:t>
+      </w:r>
+    </w:p>
+    <w:p>
+      <w:pPr>
+        <w:spacing w:after="300"/>
+      </w:pPr>
+      <w:r>
+        <w:rPr>
+          <w:i/>
+          <w:iCs/>
+        </w:rPr>
+        <w:t xml:space="preserve">(Challenge: Climate Resilience and Hydrometeorological Disaster Management)</w:t>
       </w:r>
     </w:p>
     <w:p>

</xml_diff>